<commit_message>
build(submission): rebuild CD1/CD2 final submission DOCX from corrected sources
CD1/CD2 final submission DOCX regenerated — reflects FSTS=d3c/100 alignment,
turning point 82%, k=259/K=309, and Vietnamese-decimal fixes. Verified 82%
present, stale 88,6% absent.

https://claude.ai/code/session_01GMFmEtt6FYiJ4MKzBNCLqb
</commit_message>
<xml_diff>
--- a/dist/submission_packages/cd1/CD1_submission_final.docx
+++ b/dist/submission_packages/cd1/CD1_submission_final.docx
@@ -2163,19 +2163,19 @@
               <w:jc w:val="left"/>
             </w:pPr>
             <w:r>
-              <w:t xml:space="preserve">Context-Contingent Digital Capability Model</w:t>
-            </w:r>
-          </w:p>
-        </w:tc>
-        <w:tc>
-          <w:tcPr/>
-          <w:p>
-            <w:pPr>
-              <w:pStyle w:val="Compact"/>
-              <w:jc w:val="left"/>
-            </w:pPr>
-            <w:r>
-              <w:t xml:space="preserve">Mô hình năng lực số phụ thuộc bối cảnh</w:t>
+              <w:t xml:space="preserve">Context-Contingent Digital-and-Capability Model</w:t>
+            </w:r>
+          </w:p>
+        </w:tc>
+        <w:tc>
+          <w:tcPr/>
+          <w:p>
+            <w:pPr>
+              <w:pStyle w:val="Compact"/>
+              <w:jc w:val="left"/>
+            </w:pPr>
+            <w:r>
+              <w:t xml:space="preserve">Mô hình Áp dụng số và Năng lực phụ thuộc bối cảnh</w:t>
             </w:r>
           </w:p>
         </w:tc>
@@ -4768,7 +4768,7 @@
           <w:bCs/>
           <w:b/>
         </w:rPr>
-        <w:t xml:space="preserve">Biến FSTS (Foreign Trade Sales to Total Sales)</w:t>
+        <w:t xml:space="preserve">Biến FSTS (Foreign Sales to Total Sales)</w:t>
       </w:r>
       <w:r>
         <w:t xml:space="preserve">:</w:t>
@@ -4780,10 +4780,10 @@
         <w:rPr>
           <w:rStyle w:val="VerbatimChar"/>
         </w:rPr>
-        <w:t xml:space="preserve">FSTS = (d3b + d3c) / 100</w:t>
-      </w:r>
-      <w:r>
-        <w:t xml:space="preserve">, trong đó d3b là tỷ lệ doanh thu xuất khẩu trực tiếp và d3c là tỷ lệ doanh thu xuất khẩu gián tiếp. Quan sát thiếu FSTS được gán bằng 0 nếu doanh nghiệp không xuất khẩu (d3a = "Không"); gán missing nếu không trả lời.</w:t>
+        <w:t xml:space="preserve">FSTS = d3c / 100</w:t>
+      </w:r>
+      <w:r>
+        <w:t xml:space="preserve">, trong đó d3c là tỷ lệ doanh thu xuất khẩu trực tiếp trên tổng doanh thu (nhất quán với định nghĩa trong CĐ2 và các bản thảo P3–P5/P7/P8). Quan sát thiếu FSTS được gán bằng 0 nếu doanh nghiệp không xuất khẩu (d3a = "Không"); gán missing nếu không trả lời.</w:t>
       </w:r>
     </w:p>
     <w:p>
@@ -4894,7 +4894,7 @@
         <w:t xml:space="preserve"> </w:t>
       </w:r>
       <w:r>
-        <w:t xml:space="preserve">(Aguinis et al., 2019): chuyên đề trình bày rõ (i) định nghĩa tổng thể (47 nền kinh tế châu Á và Thái Bình Dương, phân tách 41 và 7); (ii) quy trình lấy mẫu (lấy mẫu chính thức WBES); (iii) lý giải quy mô mẫu (pool 101.185); (iv) xử lý giá trị thiếu (FSTS = d3b + d3c, winsorize 1/99); (v) xây dựng biến; (vi) độ tin cậy và giá trị (TCI đa thành phần; DAI đơn thành phần Spec 1, đa thành phần Spec 2); (vii) phương pháp ước lượng (mô tả trong CĐ1; OLS và biến công cụ trong CĐ2); (viii) khoa học mở.</w:t>
+        <w:t xml:space="preserve">(Aguinis et al., 2019): chuyên đề trình bày rõ (i) định nghĩa tổng thể (47 nền kinh tế châu Á và Thái Bình Dương, phân tách 41 và 7); (ii) quy trình lấy mẫu (lấy mẫu chính thức WBES); (iii) lý giải quy mô mẫu (pool 101.185); (iv) xử lý giá trị thiếu (FSTS = d3c/100, winsorize 1/99); (v) xây dựng biến; (vi) độ tin cậy và giá trị (TCI đa thành phần; DAI đơn thành phần Spec 1, đa thành phần Spec 2); (vii) phương pháp ước lượng (mô tả trong CĐ1; OLS và biến công cụ trong CĐ2); (viii) khoa học mở.</w:t>
       </w:r>
     </w:p>
     <w:p>
@@ -7577,7 +7577,7 @@
               <w:jc w:val="left"/>
             </w:pPr>
             <w:r>
-              <w:t xml:space="preserve">U ngược; điểm uốn ~47% (CHN Đỗ &amp; Phan, 2026)</w:t>
+              <w:t xml:space="preserve">U ngược; điểm uốn ~47%</w:t>
             </w:r>
           </w:p>
         </w:tc>
@@ -12186,7 +12186,7 @@
           <w:iCs/>
           <w:i/>
         </w:rPr>
-        <w:t xml:space="preserve">Khung phân loại 9 ngành ISIC Rev. 4 (bao gồm cột Dynamism profile theo Kafouros et al., 2023).</w:t>
+        <w:t xml:space="preserve">Khung phân loại 9 ngành ISIC Rev. 4, bao gồm cột Dynamism profile per Kafouros et al. (2023).</w:t>
       </w:r>
     </w:p>
     <w:tbl>
@@ -15599,7 +15599,7 @@
         <w:t xml:space="preserve"> </w:t>
       </w:r>
       <w:r>
-        <w:t xml:space="preserve">của nhóm Advanced đổi mới sáng tạo dẫn dắt. Theo nghiên cứu Singapore (Mar, Đỗ &amp; Phan, 2026 — MIR under review): R² hiệu chỉnh = 0,196; tương tác FSTS² × DAI = 3,119 (p=0,005); điểm uốn ~88,6%.</w:t>
+        <w:t xml:space="preserve">của nhóm Advanced đổi mới sáng tạo dẫn dắt. Theo nghiên cứu Singapore (Mar, Đỗ &amp; Phan, 2026 — MIR under review): R² hiệu chỉnh = 0,196; tương tác FSTS² × DAI = 3,119 (p=0,005); điểm uốn ~82%.</w:t>
       </w:r>
     </w:p>
     <w:p>
@@ -16195,7 +16195,7 @@
         <w:pStyle w:val="FirstParagraph"/>
       </w:pPr>
       <w:r>
-        <w:t xml:space="preserve">FSTS 10,9% → 8,8%; FDI ≥10% chiếm 6,0%. Quan hệ FSTS – năng suất là hàm bậc ba với điểm uốn ~47,8% (Đỗ &amp; Phan, 2026 — JFAR).</w:t>
+        <w:t xml:space="preserve">FSTS 10,9% → 8,8%; FDI ≥10% chiếm 6,0%. Quan hệ FSTS – năng suất có dạng hàm bậc hai (U ngược) với điểm uốn ~47,5% (Đỗ &amp; Phan, 2026 — JFAR).</w:t>
       </w:r>
       <w:r>
         <w:t xml:space="preserve"> </w:t>
@@ -18234,7 +18234,7 @@
         <w:pStyle w:val="BodyText"/>
       </w:pPr>
       <w:r>
-        <w:t xml:space="preserve">Bốn quan sát: (a) EAP paradox — quản lý dẫn đầu toàn cầu nhưng ownership ceiling thấp hơn management ceiling 7,7 điểm; (b) MENA bottleneck — rào cản thể chế kép trong bối cảnh nhà nước tô (Beblawi, 1987); (c) 43/50 nền kinh tế có tỷ lệ nữ trong nhóm quản trị cấp cao cao hơn nữ sở hữu đa số; (d) hàm ý cho Chuyên đề 2: tương tác giới tính × FSTS dương tại Emerging (kênh quan hệ, Hambrick &amp; Mason, 1984) nhưng không có ý nghĩa thống kê tại Advanced.</w:t>
+        <w:t xml:space="preserve">Bốn quan sát: (a) EAP paradox — quản lý dẫn đầu toàn cầu nhưng ownership ceiling thấp hơn management ceiling 7,7 điểm; (b) MENA bottleneck — rào cản thể chế kép trong bối cảnh nhà nước tô (Beblawi, 1987); (c) 43/50 nền kinh tế có tỷ lệ nữ trong nhóm quản trị cấp cao cao hơn nữ sở hữu đa số; (d) hàm ý cho Chuyên đề 2: tương tác giới tính × FSTS dương tại Emerging qua kênh quan hệ (Hambrick &amp; Mason, 1984) nhưng không có ý nghĩa thống kê tại Advanced.</w:t>
       </w:r>
     </w:p>
     <w:bookmarkEnd w:id="73"/>
@@ -18890,7 +18890,7 @@
         <w:t xml:space="preserve">KL1 — Phi tuyến xuyên chế độ thể chế là quy luật</w:t>
       </w:r>
       <w:r>
-        <w:t xml:space="preserve">: U ngược tại Emerging (Việt Nam điểm uốn 39–46%; Trung Quốc điểm uốn 47–49%); gần tuyến tính tại Advanced (Singapore điểm uốn 88,6%); chi phí buộc phải tại SIDS.</w:t>
+        <w:t xml:space="preserve">: U ngược tại Emerging (Việt Nam điểm uốn 39–46%; Trung Quốc điểm uốn 47–49%); gần tuyến tính tại Advanced (Singapore điểm uốn 82%); chi phí buộc phải tại SIDS.</w:t>
       </w:r>
     </w:p>
     <w:p>
@@ -19074,7 +19074,7 @@
         <w:t xml:space="preserve">(4) Tái định vị chuỗi giá trị toàn cầu: lắp ráp downstream → thiết kế và R&amp;D mid-stream</w:t>
       </w:r>
       <w:r>
-        <w:t xml:space="preserve">: Việt Nam ở điểm uốn (39–46%). Trung Quốc R&amp;D 39,4% và điểm uốn cao hơn (47–49%) cho thấy: TCI cao → điểm uốn cao → chịu đựng được mức độ quốc tế hóa cao hơn.</w:t>
+        <w:t xml:space="preserve">: Việt Nam ở điểm uốn (39–46%). Trung Quốc R&amp;D 39,4% và điểm uốn cao hơn (47–49%) cho thấy: Sự chênh lệch điểm uốn giữa Trung Quốc (TP ~47–49%, Nhóm III) và Việt Nam (TP ~39–46%, Nhóm IV) phản ánh gradient ICRV, không phải gradient TCI. TCI nâng mặt bằng năng suất ở mọi mức FSTS (hiệu ứng level-shift) nhưng không trực tiếp quyết định vị trí điểm uốn — phân biệt hai cơ chế này là quan trọng cho hàm ý chính sách.</w:t>
       </w:r>
     </w:p>
     <w:p>
@@ -19500,7 +19500,7 @@
         <w:pStyle w:val="BodyText"/>
       </w:pPr>
       <w:r>
-        <w:t xml:space="preserve">Bausch, A., &amp; Krist, M. (2007). The effect of context-related moderators on the internationalization–performance relationship: Evidence from meta-analysis.</w:t>
+        <w:t xml:space="preserve">Banalieva, E. R., &amp; Dhanaraj, C. (2019). Internalization theory for the digital economy.</w:t>
       </w:r>
       <w:r>
         <w:t xml:space="preserve"> </w:t>
@@ -19510,10 +19510,10 @@
           <w:iCs/>
           <w:i/>
         </w:rPr>
-        <w:t xml:space="preserve">Management International Review, 47</w:t>
-      </w:r>
-      <w:r>
-        <w:t xml:space="preserve">(3), 319–347.</w:t>
+        <w:t xml:space="preserve">Journal of International Business Studies, 50</w:t>
+      </w:r>
+      <w:r>
+        <w:t xml:space="preserve">(8), 1372–1387.</w:t>
       </w:r>
     </w:p>
     <w:p>
@@ -19521,7 +19521,7 @@
         <w:pStyle w:val="BodyText"/>
       </w:pPr>
       <w:r>
-        <w:t xml:space="preserve">Beblawi, H. (1987). The rentier state in the Arab world. In H. Beblawi &amp; G. Luciani (Eds.),</w:t>
+        <w:t xml:space="preserve">Bausch, A., &amp; Krist, M. (2007). The effect of context-related moderators on the internationalization–performance relationship: Evidence from meta-analysis.</w:t>
       </w:r>
       <w:r>
         <w:t xml:space="preserve"> </w:t>
@@ -19531,13 +19531,10 @@
           <w:iCs/>
           <w:i/>
         </w:rPr>
-        <w:t xml:space="preserve">The rentier state</w:t>
-      </w:r>
-      <w:r>
-        <w:t xml:space="preserve"> </w:t>
-      </w:r>
-      <w:r>
-        <w:t xml:space="preserve">(pp. 49–62). Croom Helm.</w:t>
+        <w:t xml:space="preserve">Management International Review, 47</w:t>
+      </w:r>
+      <w:r>
+        <w:t xml:space="preserve">(3), 319–347.</w:t>
       </w:r>
     </w:p>
     <w:p>
@@ -19545,7 +19542,7 @@
         <w:pStyle w:val="BodyText"/>
       </w:pPr>
       <w:r>
-        <w:t xml:space="preserve">Bertram, G. (2006). Introduction: The MIRAB model in the twenty-first century.</w:t>
+        <w:t xml:space="preserve">Beblawi, H. (1987). The rentier state in the Arab world. In H. Beblawi &amp; G. Luciani (Eds.),</w:t>
       </w:r>
       <w:r>
         <w:t xml:space="preserve"> </w:t>
@@ -19555,10 +19552,13 @@
           <w:iCs/>
           <w:i/>
         </w:rPr>
-        <w:t xml:space="preserve">Asia Pacific Viewpoint, 47</w:t>
-      </w:r>
-      <w:r>
-        <w:t xml:space="preserve">(1), 1–13.</w:t>
+        <w:t xml:space="preserve">The rentier state</w:t>
+      </w:r>
+      <w:r>
+        <w:t xml:space="preserve"> </w:t>
+      </w:r>
+      <w:r>
+        <w:t xml:space="preserve">(pp. 49–62). Croom Helm.</w:t>
       </w:r>
     </w:p>
     <w:p>
@@ -19566,7 +19566,7 @@
         <w:pStyle w:val="BodyText"/>
       </w:pPr>
       <w:r>
-        <w:t xml:space="preserve">Briguglio, L. (1995). Small island developing states and their economic vulnerabilities.</w:t>
+        <w:t xml:space="preserve">Bertram, G. (2006). Introduction: The MIRAB model in the twenty-first century.</w:t>
       </w:r>
       <w:r>
         <w:t xml:space="preserve"> </w:t>
@@ -19576,10 +19576,10 @@
           <w:iCs/>
           <w:i/>
         </w:rPr>
-        <w:t xml:space="preserve">World Development, 23</w:t>
-      </w:r>
-      <w:r>
-        <w:t xml:space="preserve">(9), 1615–1632.</w:t>
+        <w:t xml:space="preserve">Asia Pacific Viewpoint, 47</w:t>
+      </w:r>
+      <w:r>
+        <w:t xml:space="preserve">(1), 1–13.</w:t>
       </w:r>
     </w:p>
     <w:p>
@@ -19587,7 +19587,7 @@
         <w:pStyle w:val="BodyText"/>
       </w:pPr>
       <w:r>
-        <w:t xml:space="preserve">Brynjolfsson, E., &amp; McAfee, A. (2014).</w:t>
+        <w:t xml:space="preserve">Briguglio, L. (1995). Small island developing states and their economic vulnerabilities.</w:t>
       </w:r>
       <w:r>
         <w:t xml:space="preserve"> </w:t>
@@ -19597,10 +19597,10 @@
           <w:iCs/>
           <w:i/>
         </w:rPr>
-        <w:t xml:space="preserve">The second machine age: Work, progress, and prosperity in a time of brilliant technologies</w:t>
-      </w:r>
-      <w:r>
-        <w:t xml:space="preserve">. W. W. Norton &amp; Company.</w:t>
+        <w:t xml:space="preserve">World Development, 23</w:t>
+      </w:r>
+      <w:r>
+        <w:t xml:space="preserve">(9), 1615–1632.</w:t>
       </w:r>
     </w:p>
     <w:p>
@@ -19608,7 +19608,7 @@
         <w:pStyle w:val="BodyText"/>
       </w:pPr>
       <w:r>
-        <w:t xml:space="preserve">Cohen, W. M., &amp; Levinthal, D. A. (1990). Absorptive capacity: A new perspective on learning and innovation.</w:t>
+        <w:t xml:space="preserve">Brynjolfsson, E., &amp; McAfee, A. (2014).</w:t>
       </w:r>
       <w:r>
         <w:t xml:space="preserve"> </w:t>
@@ -19618,10 +19618,10 @@
           <w:iCs/>
           <w:i/>
         </w:rPr>
-        <w:t xml:space="preserve">Administrative Science Quarterly, 35</w:t>
-      </w:r>
-      <w:r>
-        <w:t xml:space="preserve">(1), 128–152.</w:t>
+        <w:t xml:space="preserve">The second machine age: Work, progress, and prosperity in a time of brilliant technologies</w:t>
+      </w:r>
+      <w:r>
+        <w:t xml:space="preserve">. W. W. Norton &amp; Company.</w:t>
       </w:r>
     </w:p>
     <w:p>
@@ -19629,7 +19629,7 @@
         <w:pStyle w:val="BodyText"/>
       </w:pPr>
       <w:r>
-        <w:t xml:space="preserve">Contractor, F. J., Kundu, S. K., &amp; Hsu, C. C. (2003). A three-stage theory of international expansion.</w:t>
+        <w:t xml:space="preserve">Cohen, W. M., &amp; Levinthal, D. A. (1990). Absorptive capacity: A new perspective on learning and innovation.</w:t>
       </w:r>
       <w:r>
         <w:t xml:space="preserve"> </w:t>
@@ -19639,10 +19639,10 @@
           <w:iCs/>
           <w:i/>
         </w:rPr>
-        <w:t xml:space="preserve">Journal of International Business Studies, 34</w:t>
-      </w:r>
-      <w:r>
-        <w:t xml:space="preserve">(1), 5–18.</w:t>
+        <w:t xml:space="preserve">Administrative Science Quarterly, 35</w:t>
+      </w:r>
+      <w:r>
+        <w:t xml:space="preserve">(1), 128–152.</w:t>
       </w:r>
     </w:p>
     <w:p>
@@ -19650,7 +19650,7 @@
         <w:pStyle w:val="BodyText"/>
       </w:pPr>
       <w:r>
-        <w:t xml:space="preserve">Cusolito, A. P., &amp; Maloney, W. F. (2018).</w:t>
+        <w:t xml:space="preserve">Contractor, F. J., Kundu, S. K., &amp; Hsu, C. C. (2003). A three-stage theory of international expansion.</w:t>
       </w:r>
       <w:r>
         <w:t xml:space="preserve"> </w:t>
@@ -19660,10 +19660,10 @@
           <w:iCs/>
           <w:i/>
         </w:rPr>
-        <w:t xml:space="preserve">Productivity revisited: Shifting paradigms in analysis and policy</w:t>
-      </w:r>
-      <w:r>
-        <w:t xml:space="preserve">. World Bank Group.</w:t>
+        <w:t xml:space="preserve">Journal of International Business Studies, 34</w:t>
+      </w:r>
+      <w:r>
+        <w:t xml:space="preserve">(1), 5–18.</w:t>
       </w:r>
     </w:p>
     <w:p>
@@ -19671,7 +19671,7 @@
         <w:pStyle w:val="BodyText"/>
       </w:pPr>
       <w:r>
-        <w:t xml:space="preserve">David, P. A. (1990). The dynamo and the computer: An historical perspective on the modern productivity paradox.</w:t>
+        <w:t xml:space="preserve">Cusolito, A. P., &amp; Maloney, W. F. (2018).</w:t>
       </w:r>
       <w:r>
         <w:t xml:space="preserve"> </w:t>
@@ -19681,10 +19681,10 @@
           <w:iCs/>
           <w:i/>
         </w:rPr>
-        <w:t xml:space="preserve">American Economic Review, 80</w:t>
-      </w:r>
-      <w:r>
-        <w:t xml:space="preserve">(2), 355–361.</w:t>
+        <w:t xml:space="preserve">Productivity revisited: Shifting paradigms in analysis and policy</w:t>
+      </w:r>
+      <w:r>
+        <w:t xml:space="preserve">. World Bank Group.</w:t>
       </w:r>
     </w:p>
     <w:p>
@@ -19692,7 +19692,7 @@
         <w:pStyle w:val="BodyText"/>
       </w:pPr>
       <w:r>
-        <w:t xml:space="preserve">Đỗ, T. H., &amp; Phan, A. T. (2026). Internationalization and firm performance in Vietnam.</w:t>
+        <w:t xml:space="preserve">David, P. A. (1990). The dynamo and the computer: An historical perspective on the modern productivity paradox.</w:t>
       </w:r>
       <w:r>
         <w:t xml:space="preserve"> </w:t>
@@ -19702,13 +19702,10 @@
           <w:iCs/>
           <w:i/>
         </w:rPr>
-        <w:t xml:space="preserve">Journal of Asia Business Studies</w:t>
-      </w:r>
-      <w:r>
-        <w:t xml:space="preserve"> </w:t>
-      </w:r>
-      <w:r>
-        <w:t xml:space="preserve">(under review).</w:t>
+        <w:t xml:space="preserve">American Economic Review, 80</w:t>
+      </w:r>
+      <w:r>
+        <w:t xml:space="preserve">(2), 355–361.</w:t>
       </w:r>
     </w:p>
     <w:p>
@@ -19716,7 +19713,7 @@
         <w:pStyle w:val="BodyText"/>
       </w:pPr>
       <w:r>
-        <w:t xml:space="preserve">Hall, P. A., &amp; Soskice, D. (Eds.). (2001).</w:t>
+        <w:t xml:space="preserve">Đỗ, T. H., &amp; Phan, A. T. (2026). Internationalization and firm performance in Vietnam.</w:t>
       </w:r>
       <w:r>
         <w:t xml:space="preserve"> </w:t>
@@ -19726,10 +19723,13 @@
           <w:iCs/>
           <w:i/>
         </w:rPr>
-        <w:t xml:space="preserve">Varieties of capitalism: The institutional foundations of comparative advantage</w:t>
-      </w:r>
-      <w:r>
-        <w:t xml:space="preserve">. Oxford University Press.</w:t>
+        <w:t xml:space="preserve">Journal of Asia Business Studies</w:t>
+      </w:r>
+      <w:r>
+        <w:t xml:space="preserve"> </w:t>
+      </w:r>
+      <w:r>
+        <w:t xml:space="preserve">(under review).</w:t>
       </w:r>
     </w:p>
     <w:p>
@@ -19737,7 +19737,7 @@
         <w:pStyle w:val="BodyText"/>
       </w:pPr>
       <w:r>
-        <w:t xml:space="preserve">Hertog, S. (2010).</w:t>
+        <w:t xml:space="preserve">Hall, P. A., &amp; Soskice, D. (Eds.). (2001).</w:t>
       </w:r>
       <w:r>
         <w:t xml:space="preserve"> </w:t>
@@ -19747,10 +19747,10 @@
           <w:iCs/>
           <w:i/>
         </w:rPr>
-        <w:t xml:space="preserve">Princes, brokers, and bureaucrats: Oil and the state in Saudi Arabia</w:t>
-      </w:r>
-      <w:r>
-        <w:t xml:space="preserve">. Cornell University Press.</w:t>
+        <w:t xml:space="preserve">Varieties of capitalism: The institutional foundations of comparative advantage</w:t>
+      </w:r>
+      <w:r>
+        <w:t xml:space="preserve">. Oxford University Press.</w:t>
       </w:r>
     </w:p>
     <w:p>
@@ -19758,7 +19758,7 @@
         <w:pStyle w:val="BodyText"/>
       </w:pPr>
       <w:r>
-        <w:t xml:space="preserve">Hsieh, C.-T., &amp; Klenow, P. J. (2009). Misallocation and manufacturing TFP in China and India.</w:t>
+        <w:t xml:space="preserve">Hertog, S. (2010).</w:t>
       </w:r>
       <w:r>
         <w:t xml:space="preserve"> </w:t>
@@ -19768,10 +19768,10 @@
           <w:iCs/>
           <w:i/>
         </w:rPr>
-        <w:t xml:space="preserve">Quarterly Journal of Economics, 124</w:t>
-      </w:r>
-      <w:r>
-        <w:t xml:space="preserve">(4), 1403–1448.</w:t>
+        <w:t xml:space="preserve">Princes, brokers, and bureaucrats: Oil and the state in Saudi Arabia</w:t>
+      </w:r>
+      <w:r>
+        <w:t xml:space="preserve">. Cornell University Press.</w:t>
       </w:r>
     </w:p>
     <w:p>
@@ -19779,7 +19779,7 @@
         <w:pStyle w:val="BodyText"/>
       </w:pPr>
       <w:r>
-        <w:t xml:space="preserve">Hsieh, C.-T., &amp; Klenow, P. J. (2014). The life cycle of plants in India and Mexico.</w:t>
+        <w:t xml:space="preserve">Hsieh, C.-T., &amp; Klenow, P. J. (2009). Misallocation and manufacturing TFP in China and India.</w:t>
       </w:r>
       <w:r>
         <w:t xml:space="preserve"> </w:t>
@@ -19789,10 +19789,10 @@
           <w:iCs/>
           <w:i/>
         </w:rPr>
-        <w:t xml:space="preserve">Quarterly Journal of Economics, 129</w:t>
-      </w:r>
-      <w:r>
-        <w:t xml:space="preserve">(3), 1035–1084.</w:t>
+        <w:t xml:space="preserve">Quarterly Journal of Economics, 124</w:t>
+      </w:r>
+      <w:r>
+        <w:t xml:space="preserve">(4), 1403–1448.</w:t>
       </w:r>
     </w:p>
     <w:p>
@@ -19800,7 +19800,7 @@
         <w:pStyle w:val="BodyText"/>
       </w:pPr>
       <w:r>
-        <w:t xml:space="preserve">Johanson, J., &amp; Vahlne, J.-E. (1977). The internationalization process of the firm.</w:t>
+        <w:t xml:space="preserve">Hsieh, C.-T., &amp; Klenow, P. J. (2014). The life cycle of plants in India and Mexico.</w:t>
       </w:r>
       <w:r>
         <w:t xml:space="preserve"> </w:t>
@@ -19810,10 +19810,10 @@
           <w:iCs/>
           <w:i/>
         </w:rPr>
-        <w:t xml:space="preserve">Journal of International Business Studies, 8</w:t>
-      </w:r>
-      <w:r>
-        <w:t xml:space="preserve">(1), 23–32.</w:t>
+        <w:t xml:space="preserve">Quarterly Journal of Economics, 129</w:t>
+      </w:r>
+      <w:r>
+        <w:t xml:space="preserve">(3), 1035–1084.</w:t>
       </w:r>
     </w:p>
     <w:p>
@@ -19821,7 +19821,7 @@
         <w:pStyle w:val="BodyText"/>
       </w:pPr>
       <w:r>
-        <w:t xml:space="preserve">Johanson, J., &amp; Vahlne, J.-E. (2009). The Uppsala internationalization process model revisited.</w:t>
+        <w:t xml:space="preserve">Johanson, J., &amp; Vahlne, J.-E. (1977). The internationalization process of the firm.</w:t>
       </w:r>
       <w:r>
         <w:t xml:space="preserve"> </w:t>
@@ -19831,10 +19831,10 @@
           <w:iCs/>
           <w:i/>
         </w:rPr>
-        <w:t xml:space="preserve">Journal of International Business Studies, 40</w:t>
-      </w:r>
-      <w:r>
-        <w:t xml:space="preserve">(9), 1411–1431.</w:t>
+        <w:t xml:space="preserve">Journal of International Business Studies, 8</w:t>
+      </w:r>
+      <w:r>
+        <w:t xml:space="preserve">(1), 23–32.</w:t>
       </w:r>
     </w:p>
     <w:p>
@@ -19842,7 +19842,7 @@
         <w:pStyle w:val="BodyText"/>
       </w:pPr>
       <w:r>
-        <w:t xml:space="preserve">Kafouros, M., Wang, C., Piperopoulos, P., &amp; Zhang, M. (2023). Academic publishing in business and management.</w:t>
+        <w:t xml:space="preserve">Johanson, J., &amp; Vahlne, J.-E. (2009). The Uppsala internationalization process model revisited.</w:t>
       </w:r>
       <w:r>
         <w:t xml:space="preserve"> </w:t>
@@ -19852,10 +19852,10 @@
           <w:iCs/>
           <w:i/>
         </w:rPr>
-        <w:t xml:space="preserve">Global Strategy Journal, 13</w:t>
-      </w:r>
-      <w:r>
-        <w:t xml:space="preserve">(1), 3–28.</w:t>
+        <w:t xml:space="preserve">Journal of International Business Studies, 40</w:t>
+      </w:r>
+      <w:r>
+        <w:t xml:space="preserve">(9), 1411–1431.</w:t>
       </w:r>
     </w:p>
     <w:p>
@@ -19863,7 +19863,7 @@
         <w:pStyle w:val="BodyText"/>
       </w:pPr>
       <w:r>
-        <w:t xml:space="preserve">Kaufmann, D., Kraay, A., &amp; Mastruzzi, M. (2011). The worldwide governance indicators: Methodology and analytical issues.</w:t>
+        <w:t xml:space="preserve">Kafouros, M., Wang, C., Piperopoulos, P., &amp; Zhang, M. (2023). Academic publishing in business and management.</w:t>
       </w:r>
       <w:r>
         <w:t xml:space="preserve"> </w:t>
@@ -19873,10 +19873,10 @@
           <w:iCs/>
           <w:i/>
         </w:rPr>
-        <w:t xml:space="preserve">Hague Journal on the Rule of Law, 3</w:t>
-      </w:r>
-      <w:r>
-        <w:t xml:space="preserve">(2), 220–246.</w:t>
+        <w:t xml:space="preserve">Global Strategy Journal, 13</w:t>
+      </w:r>
+      <w:r>
+        <w:t xml:space="preserve">(1), 3–28.</w:t>
       </w:r>
     </w:p>
     <w:p>
@@ -19884,7 +19884,7 @@
         <w:pStyle w:val="BodyText"/>
       </w:pPr>
       <w:r>
-        <w:t xml:space="preserve">Khanna, T., &amp; Palepu, K. G. (2010).</w:t>
+        <w:t xml:space="preserve">Kaufmann, D., Kraay, A., &amp; Mastruzzi, M. (2011). The worldwide governance indicators: Methodology and analytical issues.</w:t>
       </w:r>
       <w:r>
         <w:t xml:space="preserve"> </w:t>
@@ -19894,10 +19894,10 @@
           <w:iCs/>
           <w:i/>
         </w:rPr>
-        <w:t xml:space="preserve">Winning in emerging markets: A road map for strategy and execution</w:t>
-      </w:r>
-      <w:r>
-        <w:t xml:space="preserve">. Harvard Business Press.</w:t>
+        <w:t xml:space="preserve">Hague Journal on the Rule of Law, 3</w:t>
+      </w:r>
+      <w:r>
+        <w:t xml:space="preserve">(2), 220–246.</w:t>
       </w:r>
     </w:p>
     <w:p>
@@ -19905,7 +19905,7 @@
         <w:pStyle w:val="BodyText"/>
       </w:pPr>
       <w:r>
-        <w:t xml:space="preserve">Kirca, A. H., Hult, G. T. M., Deligonul, S., Perryy, M. Z., &amp; Cavusgil, S. T. (2012). A multilevel examination of the drivers of firm multinationality.</w:t>
+        <w:t xml:space="preserve">Khanna, T., &amp; Palepu, K. G. (2010).</w:t>
       </w:r>
       <w:r>
         <w:t xml:space="preserve"> </w:t>
@@ -19915,10 +19915,10 @@
           <w:iCs/>
           <w:i/>
         </w:rPr>
-        <w:t xml:space="preserve">Journal of Management, 38</w:t>
-      </w:r>
-      <w:r>
-        <w:t xml:space="preserve">(2), 502–530.</w:t>
+        <w:t xml:space="preserve">Winning in emerging markets: A road map for strategy and execution</w:t>
+      </w:r>
+      <w:r>
+        <w:t xml:space="preserve">. Harvard Business Press.</w:t>
       </w:r>
     </w:p>
     <w:p>
@@ -19926,7 +19926,7 @@
         <w:pStyle w:val="BodyText"/>
       </w:pPr>
       <w:r>
-        <w:t xml:space="preserve">Lu, J. W., &amp; Beamish, P. W. (2004). International diversification and firm performance: The S-curve hypothesis.</w:t>
+        <w:t xml:space="preserve">Kirca, A. H., Hult, G. T. M., Deligonul, S., Perryy, M. Z., &amp; Cavusgil, S. T. (2012). A multilevel examination of the drivers of firm multinationality.</w:t>
       </w:r>
       <w:r>
         <w:t xml:space="preserve"> </w:t>
@@ -19936,10 +19936,10 @@
           <w:iCs/>
           <w:i/>
         </w:rPr>
-        <w:t xml:space="preserve">Academy of Management Journal, 47</w:t>
-      </w:r>
-      <w:r>
-        <w:t xml:space="preserve">(4), 598–609.</w:t>
+        <w:t xml:space="preserve">Journal of Management, 38</w:t>
+      </w:r>
+      <w:r>
+        <w:t xml:space="preserve">(2), 502–530.</w:t>
       </w:r>
     </w:p>
     <w:p>
@@ -19947,7 +19947,7 @@
         <w:pStyle w:val="BodyText"/>
       </w:pPr>
       <w:r>
-        <w:t xml:space="preserve">Mar, J., Đỗ, T. H., &amp; Phan, A. T. (2026). Digital adoption and internationalization in Singapore.</w:t>
+        <w:t xml:space="preserve">Lu, J. W., &amp; Beamish, P. W. (2004). International diversification and firm performance: The S-curve hypothesis.</w:t>
       </w:r>
       <w:r>
         <w:t xml:space="preserve"> </w:t>
@@ -19957,13 +19957,10 @@
           <w:iCs/>
           <w:i/>
         </w:rPr>
-        <w:t xml:space="preserve">Management International Review</w:t>
-      </w:r>
-      <w:r>
-        <w:t xml:space="preserve"> </w:t>
-      </w:r>
-      <w:r>
-        <w:t xml:space="preserve">(under review).</w:t>
+        <w:t xml:space="preserve">Academy of Management Journal, 47</w:t>
+      </w:r>
+      <w:r>
+        <w:t xml:space="preserve">(4), 598–609.</w:t>
       </w:r>
     </w:p>
     <w:p>
@@ -19971,7 +19968,7 @@
         <w:pStyle w:val="BodyText"/>
       </w:pPr>
       <w:r>
-        <w:t xml:space="preserve">Marano, V., Arregle, J.-L., Hitt, M. A., Spadafora, E., &amp; van Essen, M. (2016). Home country institutions and the internationalization-performance relationship.</w:t>
+        <w:t xml:space="preserve">Mar, J., Đỗ, T. H., &amp; Phan, A. T. (2026). Digital adoption and internationalization in Singapore.</w:t>
       </w:r>
       <w:r>
         <w:t xml:space="preserve"> </w:t>
@@ -19981,10 +19978,13 @@
           <w:iCs/>
           <w:i/>
         </w:rPr>
-        <w:t xml:space="preserve">Journal of Management, 42</w:t>
-      </w:r>
-      <w:r>
-        <w:t xml:space="preserve">(5), 1075–1110.</w:t>
+        <w:t xml:space="preserve">Management International Review</w:t>
+      </w:r>
+      <w:r>
+        <w:t xml:space="preserve"> </w:t>
+      </w:r>
+      <w:r>
+        <w:t xml:space="preserve">(under review).</w:t>
       </w:r>
     </w:p>
     <w:p>
@@ -19992,7 +19992,7 @@
         <w:pStyle w:val="BodyText"/>
       </w:pPr>
       <w:r>
-        <w:t xml:space="preserve">North, D. C. (1990).</w:t>
+        <w:t xml:space="preserve">Marano, V., Arregle, J.-L., Hitt, M. A., Spadafora, E., &amp; van Essen, M. (2016). Home country institutions and the internationalization-performance relationship.</w:t>
       </w:r>
       <w:r>
         <w:t xml:space="preserve"> </w:t>
@@ -20002,10 +20002,10 @@
           <w:iCs/>
           <w:i/>
         </w:rPr>
-        <w:t xml:space="preserve">Institutions, institutional change and economic performance</w:t>
-      </w:r>
-      <w:r>
-        <w:t xml:space="preserve">. Cambridge University Press.</w:t>
+        <w:t xml:space="preserve">Journal of Management, 42</w:t>
+      </w:r>
+      <w:r>
+        <w:t xml:space="preserve">(5), 1075–1110.</w:t>
       </w:r>
     </w:p>
     <w:p>
@@ -20013,7 +20013,7 @@
         <w:pStyle w:val="BodyText"/>
       </w:pPr>
       <w:r>
-        <w:t xml:space="preserve">Peng, M. W. (2001). The resource-based view and international business.</w:t>
+        <w:t xml:space="preserve">North, D. C. (1990).</w:t>
       </w:r>
       <w:r>
         <w:t xml:space="preserve"> </w:t>
@@ -20023,10 +20023,10 @@
           <w:iCs/>
           <w:i/>
         </w:rPr>
-        <w:t xml:space="preserve">Journal of Management, 27</w:t>
-      </w:r>
-      <w:r>
-        <w:t xml:space="preserve">(6), 803–829.</w:t>
+        <w:t xml:space="preserve">Institutions, institutional change and economic performance</w:t>
+      </w:r>
+      <w:r>
+        <w:t xml:space="preserve">. Cambridge University Press.</w:t>
       </w:r>
     </w:p>
     <w:p>
@@ -20034,7 +20034,7 @@
         <w:pStyle w:val="BodyText"/>
       </w:pPr>
       <w:r>
-        <w:t xml:space="preserve">Peng, M. W. (2003). Institutional transitions and strategic choices.</w:t>
+        <w:t xml:space="preserve">Peng, M. W. (2001). The resource-based view and international business.</w:t>
       </w:r>
       <w:r>
         <w:t xml:space="preserve"> </w:t>
@@ -20044,10 +20044,10 @@
           <w:iCs/>
           <w:i/>
         </w:rPr>
-        <w:t xml:space="preserve">Academy of Management Review, 28</w:t>
-      </w:r>
-      <w:r>
-        <w:t xml:space="preserve">(2), 275–296.</w:t>
+        <w:t xml:space="preserve">Journal of Management, 27</w:t>
+      </w:r>
+      <w:r>
+        <w:t xml:space="preserve">(6), 803–829.</w:t>
       </w:r>
     </w:p>
     <w:p>
@@ -20055,7 +20055,7 @@
         <w:pStyle w:val="BodyText"/>
       </w:pPr>
       <w:r>
-        <w:t xml:space="preserve">Sachs, J. D., &amp; Warner, A. M. (2001). The curse of natural resources.</w:t>
+        <w:t xml:space="preserve">Peng, M. W. (2003). Institutional transitions and strategic choices.</w:t>
       </w:r>
       <w:r>
         <w:t xml:space="preserve"> </w:t>
@@ -20065,10 +20065,10 @@
           <w:iCs/>
           <w:i/>
         </w:rPr>
-        <w:t xml:space="preserve">European Economic Review, 45</w:t>
-      </w:r>
-      <w:r>
-        <w:t xml:space="preserve">(4–6), 827–838.</w:t>
+        <w:t xml:space="preserve">Academy of Management Review, 28</w:t>
+      </w:r>
+      <w:r>
+        <w:t xml:space="preserve">(2), 275–296.</w:t>
       </w:r>
     </w:p>
     <w:p>
@@ -20076,7 +20076,7 @@
         <w:pStyle w:val="BodyText"/>
       </w:pPr>
       <w:r>
-        <w:t xml:space="preserve">Schwens, C., Zapkau, F. B., Brouthers, K. D., &amp; Hollender, L. (2018). How overconfidence can blind internationalization performance predictions.</w:t>
+        <w:t xml:space="preserve">Sachs, J. D., &amp; Warner, A. M. (2001). The curse of natural resources.</w:t>
       </w:r>
       <w:r>
         <w:t xml:space="preserve"> </w:t>
@@ -20086,10 +20086,10 @@
           <w:iCs/>
           <w:i/>
         </w:rPr>
-        <w:t xml:space="preserve">Journal of World Business, 53</w:t>
-      </w:r>
-      <w:r>
-        <w:t xml:space="preserve">(3), 290–301.</w:t>
+        <w:t xml:space="preserve">European Economic Review, 45</w:t>
+      </w:r>
+      <w:r>
+        <w:t xml:space="preserve">(4–6), 827–838.</w:t>
       </w:r>
     </w:p>
     <w:p>
@@ -20097,7 +20097,7 @@
         <w:pStyle w:val="BodyText"/>
       </w:pPr>
       <w:r>
-        <w:t xml:space="preserve">Sikdar, A., &amp; Mukhopadhyay, A. (2026). Technology spillovers and firm performance in India.</w:t>
+        <w:t xml:space="preserve">Schwens, C., Zapkau, F. B., Brouthers, K. D., &amp; Hollender, L. (2018). How overconfidence can blind internationalization performance predictions.</w:t>
       </w:r>
       <w:r>
         <w:t xml:space="preserve"> </w:t>
@@ -20107,10 +20107,10 @@
           <w:iCs/>
           <w:i/>
         </w:rPr>
-        <w:t xml:space="preserve">Asian Development Review, 43</w:t>
-      </w:r>
-      <w:r>
-        <w:t xml:space="preserve">(1), 37–75.</w:t>
+        <w:t xml:space="preserve">Journal of World Business, 53</w:t>
+      </w:r>
+      <w:r>
+        <w:t xml:space="preserve">(3), 290–301.</w:t>
       </w:r>
     </w:p>
     <w:p>
@@ -20118,7 +20118,7 @@
         <w:pStyle w:val="BodyText"/>
       </w:pPr>
       <w:r>
-        <w:t xml:space="preserve">Stallkamp, M., &amp; Schotter, A. P. J. (2021). Platforms without borders?</w:t>
+        <w:t xml:space="preserve">Sikdar, A., &amp; Mukhopadhyay, A. (2026). Technology spillovers and firm performance in India.</w:t>
       </w:r>
       <w:r>
         <w:t xml:space="preserve"> </w:t>
@@ -20128,10 +20128,10 @@
           <w:iCs/>
           <w:i/>
         </w:rPr>
-        <w:t xml:space="preserve">Global Strategy Journal, 11</w:t>
-      </w:r>
-      <w:r>
-        <w:t xml:space="preserve">(1), 58–80.</w:t>
+        <w:t xml:space="preserve">Asian Development Review, 43</w:t>
+      </w:r>
+      <w:r>
+        <w:t xml:space="preserve">(1), 37–75.</w:t>
       </w:r>
     </w:p>
     <w:p>
@@ -20139,7 +20139,7 @@
         <w:pStyle w:val="BodyText"/>
       </w:pPr>
       <w:r>
-        <w:t xml:space="preserve">Teece, D. J., Pisano, G., &amp; Shuen, A. (1997). Dynamic capabilities and strategic management.</w:t>
+        <w:t xml:space="preserve">StartupBlink. (2026).</w:t>
       </w:r>
       <w:r>
         <w:t xml:space="preserve"> </w:t>
@@ -20149,10 +20149,10 @@
           <w:iCs/>
           <w:i/>
         </w:rPr>
-        <w:t xml:space="preserve">Strategic Management Journal, 18</w:t>
-      </w:r>
-      <w:r>
-        <w:t xml:space="preserve">(7), 509–533.</w:t>
+        <w:t xml:space="preserve">Global startup ecosystem index 2026</w:t>
+      </w:r>
+      <w:r>
+        <w:t xml:space="preserve">. StartupBlink Research.</w:t>
       </w:r>
     </w:p>
     <w:p>
@@ -20160,7 +20160,7 @@
         <w:pStyle w:val="BodyText"/>
       </w:pPr>
       <w:r>
-        <w:t xml:space="preserve">UNCTAD. (2023).</w:t>
+        <w:t xml:space="preserve">Stallkamp, M., &amp; Schotter, A. P. J. (2021). Platforms without borders?</w:t>
       </w:r>
       <w:r>
         <w:t xml:space="preserve"> </w:t>
@@ -20170,10 +20170,10 @@
           <w:iCs/>
           <w:i/>
         </w:rPr>
-        <w:t xml:space="preserve">World investment report 2023</w:t>
-      </w:r>
-      <w:r>
-        <w:t xml:space="preserve">. United Nations Conference on Trade and Development.</w:t>
+        <w:t xml:space="preserve">Global Strategy Journal, 11</w:t>
+      </w:r>
+      <w:r>
+        <w:t xml:space="preserve">(1), 58–80.</w:t>
       </w:r>
     </w:p>
     <w:p>
@@ -20181,7 +20181,7 @@
         <w:pStyle w:val="BodyText"/>
       </w:pPr>
       <w:r>
-        <w:t xml:space="preserve">Venkatraman, N., &amp; Ramanujam, V. (1986). Measurement of business performance in strategy research.</w:t>
+        <w:t xml:space="preserve">Teece, D. J., Pisano, G., &amp; Shuen, A. (1997). Dynamic capabilities and strategic management.</w:t>
       </w:r>
       <w:r>
         <w:t xml:space="preserve"> </w:t>
@@ -20191,10 +20191,10 @@
           <w:iCs/>
           <w:i/>
         </w:rPr>
-        <w:t xml:space="preserve">Academy of Management Review, 11</w:t>
-      </w:r>
-      <w:r>
-        <w:t xml:space="preserve">(4), 801–814.</w:t>
+        <w:t xml:space="preserve">Strategic Management Journal, 18</w:t>
+      </w:r>
+      <w:r>
+        <w:t xml:space="preserve">(7), 509–533.</w:t>
       </w:r>
     </w:p>
     <w:p>
@@ -20202,7 +20202,7 @@
         <w:pStyle w:val="BodyText"/>
       </w:pPr>
       <w:r>
-        <w:t xml:space="preserve">Verhoef, P. C., Broekhuizen, T., Bart, Y., Bhattacharya, A., Dong, J. Q., Fabian, N., &amp; Haenlein, M. (2021). Digital transformation: A multidisciplinary reflection and research agenda.</w:t>
+        <w:t xml:space="preserve">UNCTAD. (2023).</w:t>
       </w:r>
       <w:r>
         <w:t xml:space="preserve"> </w:t>
@@ -20212,10 +20212,10 @@
           <w:iCs/>
           <w:i/>
         </w:rPr>
-        <w:t xml:space="preserve">Journal of Business Research, 122</w:t>
-      </w:r>
-      <w:r>
-        <w:t xml:space="preserve">, 889–901.</w:t>
+        <w:t xml:space="preserve">World investment report 2023</w:t>
+      </w:r>
+      <w:r>
+        <w:t xml:space="preserve">. United Nations Conference on Trade and Development.</w:t>
       </w:r>
     </w:p>
     <w:p>
@@ -20223,7 +20223,7 @@
         <w:pStyle w:val="BodyText"/>
       </w:pPr>
       <w:r>
-        <w:t xml:space="preserve">Wang, J., Huang, Y., &amp; Hong, H. (2024). Technology concentration and bank risk: Evidence from Chinese commercial banks.</w:t>
+        <w:t xml:space="preserve">Venkatraman, N., &amp; Ramanujam, V. (1986). Measurement of business performance in strategy research.</w:t>
       </w:r>
       <w:r>
         <w:t xml:space="preserve"> </w:t>
@@ -20233,10 +20233,10 @@
           <w:iCs/>
           <w:i/>
         </w:rPr>
-        <w:t xml:space="preserve">International Review of Financial Analysis, 91</w:t>
-      </w:r>
-      <w:r>
-        <w:t xml:space="preserve">, 102968.</w:t>
+        <w:t xml:space="preserve">Academy of Management Review, 11</w:t>
+      </w:r>
+      <w:r>
+        <w:t xml:space="preserve">(4), 801–814.</w:t>
       </w:r>
     </w:p>
     <w:p>
@@ -20244,7 +20244,7 @@
         <w:pStyle w:val="BodyText"/>
       </w:pPr>
       <w:r>
-        <w:t xml:space="preserve">Wernerfelt, B. (1984). A resource-based view of the firm.</w:t>
+        <w:t xml:space="preserve">Verhoef, P. C., Broekhuizen, T., Bart, Y., Bhattacharya, A., Dong, J. Q., Fabian, N., &amp; Haenlein, M. (2021). Digital transformation: A multidisciplinary reflection and research agenda.</w:t>
       </w:r>
       <w:r>
         <w:t xml:space="preserve"> </w:t>
@@ -20254,10 +20254,10 @@
           <w:iCs/>
           <w:i/>
         </w:rPr>
-        <w:t xml:space="preserve">Strategic Management Journal, 5</w:t>
-      </w:r>
-      <w:r>
-        <w:t xml:space="preserve">(2), 171–180.</w:t>
+        <w:t xml:space="preserve">Journal of Business Research, 122</w:t>
+      </w:r>
+      <w:r>
+        <w:t xml:space="preserve">, 889–901.</w:t>
       </w:r>
     </w:p>
     <w:p>
@@ -20265,7 +20265,7 @@
         <w:pStyle w:val="BodyText"/>
       </w:pPr>
       <w:r>
-        <w:t xml:space="preserve">Williamson, O. E. (1985).</w:t>
+        <w:t xml:space="preserve">Wang, J., Huang, Y., &amp; Hong, H. (2024). Technology concentration and bank risk: Evidence from Chinese commercial banks.</w:t>
       </w:r>
       <w:r>
         <w:t xml:space="preserve"> </w:t>
@@ -20275,10 +20275,94 @@
           <w:iCs/>
           <w:i/>
         </w:rPr>
+        <w:t xml:space="preserve">International Review of Financial Analysis, 91</w:t>
+      </w:r>
+      <w:r>
+        <w:t xml:space="preserve">, 102968.</w:t>
+      </w:r>
+    </w:p>
+    <w:p>
+      <w:pPr>
+        <w:pStyle w:val="BodyText"/>
+      </w:pPr>
+      <w:r>
+        <w:t xml:space="preserve">Wernerfelt, B. (1984). A resource-based view of the firm.</w:t>
+      </w:r>
+      <w:r>
+        <w:t xml:space="preserve"> </w:t>
+      </w:r>
+      <w:r>
+        <w:rPr>
+          <w:iCs/>
+          <w:i/>
+        </w:rPr>
+        <w:t xml:space="preserve">Strategic Management Journal, 5</w:t>
+      </w:r>
+      <w:r>
+        <w:t xml:space="preserve">(2), 171–180.</w:t>
+      </w:r>
+    </w:p>
+    <w:p>
+      <w:pPr>
+        <w:pStyle w:val="BodyText"/>
+      </w:pPr>
+      <w:r>
+        <w:t xml:space="preserve">Williamson, O. E. (1985).</w:t>
+      </w:r>
+      <w:r>
+        <w:t xml:space="preserve"> </w:t>
+      </w:r>
+      <w:r>
+        <w:rPr>
+          <w:iCs/>
+          <w:i/>
+        </w:rPr>
         <w:t xml:space="preserve">The economic institutions of capitalism</w:t>
       </w:r>
       <w:r>
         <w:t xml:space="preserve">. Free Press.</w:t>
+      </w:r>
+    </w:p>
+    <w:p>
+      <w:pPr>
+        <w:pStyle w:val="BodyText"/>
+      </w:pPr>
+      <w:r>
+        <w:t xml:space="preserve">World Bank. (2023).</w:t>
+      </w:r>
+      <w:r>
+        <w:t xml:space="preserve"> </w:t>
+      </w:r>
+      <w:r>
+        <w:rPr>
+          <w:iCs/>
+          <w:i/>
+        </w:rPr>
+        <w:t xml:space="preserve">World Bank Enterprise Surveys 2023</w:t>
+      </w:r>
+      <w:r>
+        <w:t xml:space="preserve">. World Bank Group.</w:t>
+      </w:r>
+    </w:p>
+    <w:p>
+      <w:pPr>
+        <w:pStyle w:val="BodyText"/>
+      </w:pPr>
+      <w:r>
+        <w:t xml:space="preserve">World Bank. (2024).</w:t>
+      </w:r>
+      <w:r>
+        <w:t xml:space="preserve"> </w:t>
+      </w:r>
+      <w:r>
+        <w:rPr>
+          <w:iCs/>
+          <w:i/>
+        </w:rPr>
+        <w:t xml:space="preserve">World development indicators 2024</w:t>
+      </w:r>
+      <w:r>
+        <w:t xml:space="preserve">. World Bank Group.</w:t>
       </w:r>
     </w:p>
     <w:p>
@@ -21147,7 +21231,7 @@
     <w:bookmarkEnd w:id="89"/>
     <w:sectPr>
       <w:pgSz w:h="16838" w:w="11906"/>
-      <w:pgMar w:bottom="1417" w:left="1417" w:right="1417" w:top="1417"/>
+      <w:pgMar w:bottom="1134" w:left="1701" w:right="1134" w:top="1134"/>
     </w:sectPr>
   </w:body>
 </w:document>
@@ -21491,13 +21575,13 @@
     <w:name w:val="Normal"/>
     <w:qFormat/>
     <w:pPr>
-      <w:spacing w:line="276" w:lineRule="auto"/>
+      <w:spacing w:line="360" w:lineRule="auto"/>
       <w:jc w:val="both"/>
     </w:pPr>
     <w:rPr>
       <w:rFonts w:ascii="Times New Roman" w:eastAsia="Times New Roman" w:hAnsi="Times New Roman"/>
       <w:color w:val="000000"/>
-      <w:sz w:val="24"/>
+      <w:sz w:val="26"/>
     </w:rPr>
   </w:style>
   <w:style w:styleId="BodyText" w:type="paragraph">
@@ -21505,14 +21589,14 @@
     <w:basedOn w:val="Normal"/>
     <w:link w:val="BodyTextChar"/>
     <w:pPr>
-      <w:spacing w:after="180" w:before="180" w:line="276" w:lineRule="auto"/>
+      <w:spacing w:after="180" w:before="180" w:line="360" w:lineRule="auto"/>
       <w:jc w:val="both"/>
     </w:pPr>
     <w:qFormat/>
     <w:rPr>
       <w:rFonts w:ascii="Times New Roman" w:eastAsia="Times New Roman" w:hAnsi="Times New Roman"/>
       <w:color w:val="000000"/>
-      <w:sz w:val="24"/>
+      <w:sz w:val="26"/>
     </w:rPr>
   </w:style>
   <w:style w:customStyle="1" w:styleId="FirstParagraph" w:type="paragraph">
@@ -21521,13 +21605,13 @@
     <w:next w:val="BodyText"/>
     <w:qFormat/>
     <w:pPr>
-      <w:spacing w:line="276" w:lineRule="auto"/>
+      <w:spacing w:line="360" w:lineRule="auto"/>
       <w:jc w:val="both"/>
     </w:pPr>
     <w:rPr>
       <w:rFonts w:ascii="Times New Roman" w:eastAsia="Times New Roman" w:hAnsi="Times New Roman"/>
       <w:color w:val="000000"/>
-      <w:sz w:val="24"/>
+      <w:sz w:val="26"/>
     </w:rPr>
   </w:style>
   <w:style w:customStyle="1" w:styleId="Compact" w:type="paragraph">
@@ -21535,13 +21619,13 @@
     <w:basedOn w:val="BodyText"/>
     <w:qFormat/>
     <w:pPr>
-      <w:spacing w:after="36" w:before="36" w:line="276" w:lineRule="auto"/>
+      <w:spacing w:after="36" w:before="36" w:line="360" w:lineRule="auto"/>
       <w:jc w:val="both"/>
     </w:pPr>
     <w:rPr>
       <w:rFonts w:ascii="Times New Roman" w:eastAsia="Times New Roman" w:hAnsi="Times New Roman"/>
       <w:color w:val="000000"/>
-      <w:sz w:val="24"/>
+      <w:sz w:val="26"/>
     </w:rPr>
   </w:style>
   <w:style w:styleId="Title" w:type="paragraph">
@@ -21552,7 +21636,7 @@
     <w:pPr>
       <w:keepNext/>
       <w:keepLines/>
-      <w:spacing w:after="240" w:before="480" w:line="276" w:lineRule="auto"/>
+      <w:spacing w:after="240" w:before="480" w:line="360" w:lineRule="auto"/>
       <w:jc w:val="both"/>
     </w:pPr>
     <w:rPr>
@@ -21560,7 +21644,7 @@
       <w:b/>
       <w:bCs/>
       <w:color w:val="000000"/>
-      <w:sz w:val="24"/>
+      <w:sz w:val="26"/>
       <w:szCs w:val="36"/>
     </w:rPr>
   </w:style>
@@ -21572,13 +21656,13 @@
     <w:pPr>
       <w:keepNext/>
       <w:keepLines/>
-      <w:spacing w:after="240" w:before="240" w:line="276" w:lineRule="auto"/>
+      <w:spacing w:after="240" w:before="240" w:line="360" w:lineRule="auto"/>
       <w:jc w:val="both"/>
     </w:pPr>
     <w:rPr>
       <w:rFonts w:ascii="Times New Roman" w:eastAsia="Times New Roman" w:hAnsi="Times New Roman"/>
       <w:color w:val="000000"/>
-      <w:sz w:val="24"/>
+      <w:sz w:val="26"/>
       <w:szCs w:val="30"/>
     </w:rPr>
   </w:style>
@@ -21589,13 +21673,13 @@
     <w:pPr>
       <w:keepNext/>
       <w:keepLines/>
-      <w:spacing w:line="276" w:lineRule="auto"/>
+      <w:spacing w:line="360" w:lineRule="auto"/>
       <w:jc w:val="both"/>
     </w:pPr>
     <w:rPr>
       <w:rFonts w:ascii="Times New Roman" w:eastAsia="Times New Roman" w:hAnsi="Times New Roman"/>
       <w:color w:val="000000"/>
-      <w:sz w:val="24"/>
+      <w:sz w:val="26"/>
     </w:rPr>
   </w:style>
   <w:style w:styleId="Date" w:type="paragraph">
@@ -21605,13 +21689,13 @@
     <w:pPr>
       <w:keepNext/>
       <w:keepLines/>
-      <w:spacing w:line="276" w:lineRule="auto"/>
+      <w:spacing w:line="360" w:lineRule="auto"/>
       <w:jc w:val="both"/>
     </w:pPr>
     <w:rPr>
       <w:rFonts w:ascii="Times New Roman" w:eastAsia="Times New Roman" w:hAnsi="Times New Roman"/>
       <w:color w:val="000000"/>
-      <w:sz w:val="24"/>
+      <w:sz w:val="26"/>
     </w:rPr>
   </w:style>
   <w:style w:customStyle="1" w:styleId="AbstractTitle" w:type="paragraph">
@@ -21623,11 +21707,11 @@
       <w:keepNext/>
       <w:keepLines/>
       <w:jc w:val="both"/>
-      <w:spacing w:after="0" w:before="300" w:line="276" w:lineRule="auto"/>
+      <w:spacing w:after="0" w:before="300" w:line="360" w:lineRule="auto"/>
     </w:pPr>
     <w:rPr>
       <w:color w:val="000000"/>
-      <w:sz w:val="24"/>
+      <w:sz w:val="26"/>
       <w:szCs w:val="20"/>
       <w:rFonts w:ascii="Times New Roman" w:eastAsia="Times New Roman" w:hAnsi="Times New Roman"/>
       <w:b/>
@@ -21641,13 +21725,13 @@
     <w:pPr>
       <w:keepNext/>
       <w:keepLines/>
-      <w:spacing w:after="300" w:before="100" w:line="276" w:lineRule="auto"/>
+      <w:spacing w:after="300" w:before="100" w:line="360" w:lineRule="auto"/>
       <w:jc w:val="both"/>
     </w:pPr>
     <w:rPr>
       <w:rFonts w:ascii="Times New Roman" w:eastAsia="Times New Roman" w:hAnsi="Times New Roman"/>
       <w:color w:val="000000"/>
-      <w:sz w:val="24"/>
+      <w:sz w:val="26"/>
       <w:szCs w:val="20"/>
     </w:rPr>
   </w:style>
@@ -21657,13 +21741,13 @@
     <w:next w:val="Bibliography"/>
     <w:qFormat/>
     <w:pPr>
-      <w:spacing w:line="276" w:lineRule="auto"/>
+      <w:spacing w:line="360" w:lineRule="auto"/>
       <w:jc w:val="both"/>
     </w:pPr>
     <w:rPr>
       <w:rFonts w:ascii="Times New Roman" w:eastAsia="Times New Roman" w:hAnsi="Times New Roman"/>
       <w:color w:val="000000"/>
-      <w:sz w:val="24"/>
+      <w:sz w:val="26"/>
     </w:rPr>
   </w:style>
   <w:style w:styleId="Heading1" w:type="paragraph">
@@ -21675,7 +21759,7 @@
     <w:pPr>
       <w:keepNext/>
       <w:keepLines/>
-      <w:spacing w:after="0" w:before="480" w:line="276" w:lineRule="auto"/>
+      <w:spacing w:after="0" w:before="480" w:line="360" w:lineRule="auto"/>
       <w:jc w:val="both"/>
       <w:outlineLvl w:val="0"/>
     </w:pPr>
@@ -21684,7 +21768,7 @@
       <w:b/>
       <w:bCs/>
       <w:color w:val="000000"/>
-      <w:sz w:val="24"/>
+      <w:sz w:val="26"/>
       <w:szCs w:val="32"/>
     </w:rPr>
   </w:style>
@@ -21698,7 +21782,7 @@
     <w:pPr>
       <w:keepNext/>
       <w:keepLines/>
-      <w:spacing w:after="0" w:before="200" w:line="276" w:lineRule="auto"/>
+      <w:spacing w:after="0" w:before="200" w:line="360" w:lineRule="auto"/>
       <w:jc w:val="both"/>
       <w:outlineLvl w:val="1"/>
     </w:pPr>
@@ -21707,7 +21791,7 @@
       <w:b/>
       <w:bCs/>
       <w:color w:val="000000"/>
-      <w:sz w:val="24"/>
+      <w:sz w:val="26"/>
       <w:szCs w:val="28"/>
     </w:rPr>
   </w:style>
@@ -21721,7 +21805,7 @@
     <w:pPr>
       <w:keepNext/>
       <w:keepLines/>
-      <w:spacing w:after="0" w:before="200" w:line="276" w:lineRule="auto"/>
+      <w:spacing w:after="0" w:before="200" w:line="360" w:lineRule="auto"/>
       <w:jc w:val="both"/>
       <w:outlineLvl w:val="2"/>
     </w:pPr>
@@ -21730,7 +21814,7 @@
       <w:b/>
       <w:bCs/>
       <w:color w:val="000000"/>
-      <w:sz w:val="24"/>
+      <w:sz w:val="26"/>
       <w:szCs w:val="24"/>
     </w:rPr>
   </w:style>
@@ -21744,7 +21828,7 @@
     <w:pPr>
       <w:keepNext/>
       <w:keepLines/>
-      <w:spacing w:after="0" w:before="200" w:line="276" w:lineRule="auto"/>
+      <w:spacing w:after="0" w:before="200" w:line="360" w:lineRule="auto"/>
       <w:jc w:val="both"/>
       <w:outlineLvl w:val="3"/>
     </w:pPr>
@@ -21753,7 +21837,7 @@
       <w:i/>
       <w:bCs/>
       <w:color w:val="000000"/>
-      <w:sz w:val="24"/>
+      <w:sz w:val="26"/>
       <w:szCs w:val="24"/>
     </w:rPr>
   </w:style>
@@ -21767,7 +21851,7 @@
     <w:pPr>
       <w:keepNext/>
       <w:keepLines/>
-      <w:spacing w:after="0" w:before="200" w:line="276" w:lineRule="auto"/>
+      <w:spacing w:after="0" w:before="200" w:line="360" w:lineRule="auto"/>
       <w:jc w:val="both"/>
       <w:outlineLvl w:val="4"/>
     </w:pPr>
@@ -21775,7 +21859,7 @@
       <w:rFonts w:ascii="Times New Roman" w:asciiTheme="majorHAnsi" w:cstheme="majorBidi" w:eastAsia="Times New Roman" w:eastAsiaTheme="majorEastAsia" w:hAnsi="Times New Roman" w:hAnsiTheme="majorHAnsi"/>
       <w:iCs/>
       <w:color w:val="000000"/>
-      <w:sz w:val="24"/>
+      <w:sz w:val="26"/>
       <w:szCs w:val="24"/>
     </w:rPr>
   </w:style>
@@ -21789,14 +21873,14 @@
     <w:pPr>
       <w:keepNext/>
       <w:keepLines/>
-      <w:spacing w:after="0" w:before="200" w:line="276" w:lineRule="auto"/>
+      <w:spacing w:after="0" w:before="200" w:line="360" w:lineRule="auto"/>
       <w:jc w:val="both"/>
       <w:outlineLvl w:val="5"/>
     </w:pPr>
     <w:rPr>
       <w:rFonts w:ascii="Times New Roman" w:asciiTheme="majorHAnsi" w:cstheme="majorBidi" w:eastAsia="Times New Roman" w:eastAsiaTheme="majorEastAsia" w:hAnsi="Times New Roman" w:hAnsiTheme="majorHAnsi"/>
       <w:color w:val="000000"/>
-      <w:sz w:val="24"/>
+      <w:sz w:val="26"/>
       <w:szCs w:val="24"/>
     </w:rPr>
   </w:style>
@@ -21810,14 +21894,14 @@
     <w:pPr>
       <w:keepNext/>
       <w:keepLines/>
-      <w:spacing w:after="0" w:before="200" w:line="276" w:lineRule="auto"/>
+      <w:spacing w:after="0" w:before="200" w:line="360" w:lineRule="auto"/>
       <w:jc w:val="both"/>
       <w:outlineLvl w:val="6"/>
     </w:pPr>
     <w:rPr>
       <w:rFonts w:ascii="Times New Roman" w:asciiTheme="majorHAnsi" w:cstheme="majorBidi" w:eastAsia="Times New Roman" w:eastAsiaTheme="majorEastAsia" w:hAnsi="Times New Roman" w:hAnsiTheme="majorHAnsi"/>
       <w:color w:val="000000"/>
-      <w:sz w:val="24"/>
+      <w:sz w:val="26"/>
       <w:szCs w:val="24"/>
     </w:rPr>
   </w:style>
@@ -21831,14 +21915,14 @@
     <w:pPr>
       <w:keepNext/>
       <w:keepLines/>
-      <w:spacing w:after="0" w:before="200" w:line="276" w:lineRule="auto"/>
+      <w:spacing w:after="0" w:before="200" w:line="360" w:lineRule="auto"/>
       <w:jc w:val="both"/>
       <w:outlineLvl w:val="7"/>
     </w:pPr>
     <w:rPr>
       <w:rFonts w:ascii="Times New Roman" w:asciiTheme="majorHAnsi" w:cstheme="majorBidi" w:eastAsia="Times New Roman" w:eastAsiaTheme="majorEastAsia" w:hAnsi="Times New Roman" w:hAnsiTheme="majorHAnsi"/>
       <w:color w:val="000000"/>
-      <w:sz w:val="24"/>
+      <w:sz w:val="26"/>
       <w:szCs w:val="24"/>
     </w:rPr>
   </w:style>
@@ -21852,14 +21936,14 @@
     <w:pPr>
       <w:keepNext/>
       <w:keepLines/>
-      <w:spacing w:after="0" w:before="200" w:line="276" w:lineRule="auto"/>
+      <w:spacing w:after="0" w:before="200" w:line="360" w:lineRule="auto"/>
       <w:jc w:val="both"/>
       <w:outlineLvl w:val="8"/>
     </w:pPr>
     <w:rPr>
       <w:rFonts w:ascii="Times New Roman" w:asciiTheme="majorHAnsi" w:cstheme="majorBidi" w:eastAsia="Times New Roman" w:eastAsiaTheme="majorEastAsia" w:hAnsi="Times New Roman" w:hAnsiTheme="majorHAnsi"/>
       <w:color w:val="000000"/>
-      <w:sz w:val="24"/>
+      <w:sz w:val="26"/>
       <w:szCs w:val="24"/>
     </w:rPr>
   </w:style>
@@ -21871,14 +21955,14 @@
     <w:unhideWhenUsed/>
     <w:qFormat/>
     <w:pPr>
-      <w:spacing w:after="100" w:before="100" w:line="276" w:lineRule="auto"/>
+      <w:spacing w:after="100" w:before="100" w:line="360" w:lineRule="auto"/>
       <w:ind w:firstLine="0" w:left="480" w:right="480"/>
       <w:jc w:val="both"/>
     </w:pPr>
     <w:rPr>
       <w:rFonts w:ascii="Times New Roman" w:eastAsia="Times New Roman" w:hAnsi="Times New Roman"/>
       <w:color w:val="000000"/>
-      <w:sz w:val="24"/>
+      <w:sz w:val="26"/>
     </w:rPr>
   </w:style>
   <w:style w:styleId="FootnoteText" w:type="paragraph">
@@ -21889,13 +21973,13 @@
     <w:unhideWhenUsed/>
     <w:qFormat/>
     <w:pPr>
-      <w:spacing w:line="276" w:lineRule="auto"/>
+      <w:spacing w:line="360" w:lineRule="auto"/>
       <w:jc w:val="both"/>
     </w:pPr>
     <w:rPr>
       <w:rFonts w:ascii="Times New Roman" w:eastAsia="Times New Roman" w:hAnsi="Times New Roman"/>
       <w:color w:val="000000"/>
-      <w:sz w:val="24"/>
+      <w:sz w:val="26"/>
     </w:rPr>
   </w:style>
   <w:style w:default="1" w:styleId="DefaultParagraphFont" w:type="character">
@@ -21905,7 +21989,7 @@
     <w:rPr>
       <w:rFonts w:ascii="Times New Roman" w:eastAsia="Times New Roman" w:hAnsi="Times New Roman"/>
       <w:color w:val="000000"/>
-      <w:sz w:val="24"/>
+      <w:sz w:val="26"/>
     </w:rPr>
   </w:style>
   <w:style w:default="1" w:styleId="Table" w:type="table">
@@ -21915,13 +21999,13 @@
     <w:unhideWhenUsed/>
     <w:qFormat/>
     <w:pPr>
-      <w:spacing w:line="276" w:lineRule="auto"/>
+      <w:spacing w:line="360" w:lineRule="auto"/>
       <w:jc w:val="both"/>
     </w:pPr>
     <w:rPr>
       <w:rFonts w:ascii="Times New Roman" w:eastAsia="Times New Roman" w:hAnsi="Times New Roman"/>
       <w:color w:val="000000"/>
-      <w:sz w:val="24"/>
+      <w:sz w:val="26"/>
     </w:rPr>
     <w:tblPr>
       <w:tblInd w:type="dxa" w:w="0"/>
@@ -21955,27 +22039,27 @@
     <w:pPr>
       <w:keepNext/>
       <w:keepLines/>
-      <w:spacing w:after="0" w:line="276" w:lineRule="auto"/>
+      <w:spacing w:after="0" w:line="360" w:lineRule="auto"/>
       <w:jc w:val="both"/>
     </w:pPr>
     <w:rPr>
       <w:rFonts w:ascii="Times New Roman" w:eastAsia="Times New Roman" w:hAnsi="Times New Roman"/>
       <w:b/>
       <w:color w:val="000000"/>
-      <w:sz w:val="24"/>
+      <w:sz w:val="26"/>
     </w:rPr>
   </w:style>
   <w:style w:customStyle="1" w:styleId="Definition" w:type="paragraph">
     <w:name w:val="Definition"/>
     <w:basedOn w:val="Normal"/>
     <w:pPr>
-      <w:spacing w:line="276" w:lineRule="auto"/>
+      <w:spacing w:line="360" w:lineRule="auto"/>
       <w:jc w:val="both"/>
     </w:pPr>
     <w:rPr>
       <w:rFonts w:ascii="Times New Roman" w:eastAsia="Times New Roman" w:hAnsi="Times New Roman"/>
       <w:color w:val="000000"/>
-      <w:sz w:val="24"/>
+      <w:sz w:val="26"/>
     </w:rPr>
   </w:style>
   <w:style w:styleId="Caption" w:type="paragraph">
@@ -21983,14 +22067,14 @@
     <w:basedOn w:val="Normal"/>
     <w:link w:val="BodyTextChar"/>
     <w:pPr>
-      <w:spacing w:after="120" w:before="0" w:line="276" w:lineRule="auto"/>
+      <w:spacing w:after="120" w:before="0" w:line="360" w:lineRule="auto"/>
       <w:jc w:val="both"/>
     </w:pPr>
     <w:rPr>
       <w:rFonts w:ascii="Times New Roman" w:eastAsia="Times New Roman" w:hAnsi="Times New Roman"/>
       <w:i/>
       <w:color w:val="000000"/>
-      <w:sz w:val="24"/>
+      <w:sz w:val="26"/>
     </w:rPr>
   </w:style>
   <w:style w:customStyle="1" w:styleId="TableCaption" w:type="paragraph">
@@ -21998,39 +22082,39 @@
     <w:basedOn w:val="Caption"/>
     <w:pPr>
       <w:keepNext/>
-      <w:spacing w:line="276" w:lineRule="auto"/>
+      <w:spacing w:line="360" w:lineRule="auto"/>
       <w:jc w:val="both"/>
     </w:pPr>
     <w:rPr>
       <w:rFonts w:ascii="Times New Roman" w:eastAsia="Times New Roman" w:hAnsi="Times New Roman"/>
       <w:color w:val="000000"/>
-      <w:sz w:val="24"/>
+      <w:sz w:val="26"/>
     </w:rPr>
   </w:style>
   <w:style w:customStyle="1" w:styleId="ImageCaption" w:type="paragraph">
     <w:name w:val="Image Caption"/>
     <w:basedOn w:val="Caption"/>
     <w:pPr>
-      <w:spacing w:line="276" w:lineRule="auto"/>
+      <w:spacing w:line="360" w:lineRule="auto"/>
       <w:jc w:val="both"/>
     </w:pPr>
     <w:rPr>
       <w:rFonts w:ascii="Times New Roman" w:eastAsia="Times New Roman" w:hAnsi="Times New Roman"/>
       <w:color w:val="000000"/>
-      <w:sz w:val="24"/>
+      <w:sz w:val="26"/>
     </w:rPr>
   </w:style>
   <w:style w:customStyle="1" w:styleId="Figure" w:type="paragraph">
     <w:name w:val="Figure"/>
     <w:basedOn w:val="Normal"/>
     <w:pPr>
-      <w:spacing w:line="276" w:lineRule="auto"/>
+      <w:spacing w:line="360" w:lineRule="auto"/>
       <w:jc w:val="both"/>
     </w:pPr>
     <w:rPr>
       <w:rFonts w:ascii="Times New Roman" w:eastAsia="Times New Roman" w:hAnsi="Times New Roman"/>
       <w:color w:val="000000"/>
-      <w:sz w:val="24"/>
+      <w:sz w:val="26"/>
     </w:rPr>
   </w:style>
   <w:style w:customStyle="1" w:styleId="CaptionedFigure" w:type="paragraph">
@@ -22038,13 +22122,13 @@
     <w:basedOn w:val="Figure"/>
     <w:pPr>
       <w:keepNext/>
-      <w:spacing w:line="276" w:lineRule="auto"/>
+      <w:spacing w:line="360" w:lineRule="auto"/>
       <w:jc w:val="both"/>
     </w:pPr>
     <w:rPr>
       <w:rFonts w:ascii="Times New Roman" w:eastAsia="Times New Roman" w:hAnsi="Times New Roman"/>
       <w:color w:val="000000"/>
-      <w:sz w:val="24"/>
+      <w:sz w:val="26"/>
     </w:rPr>
   </w:style>
   <w:style w:customStyle="1" w:styleId="BodyTextChar" w:type="character">
@@ -22054,7 +22138,7 @@
     <w:rPr>
       <w:rFonts w:ascii="Times New Roman" w:eastAsia="Times New Roman" w:hAnsi="Times New Roman"/>
       <w:color w:val="000000"/>
-      <w:sz w:val="24"/>
+      <w:sz w:val="26"/>
     </w:rPr>
   </w:style>
   <w:style w:customStyle="1" w:styleId="VerbatimChar" w:type="character">
@@ -22063,7 +22147,7 @@
     <w:rPr>
       <w:rFonts w:ascii="Times New Roman" w:eastAsia="Times New Roman" w:hAnsi="Times New Roman"/>
       <w:color w:val="000000"/>
-      <w:sz w:val="24"/>
+      <w:sz w:val="26"/>
     </w:rPr>
   </w:style>
   <w:style w:customStyle="1" w:styleId="SectionNumber" w:type="character">
@@ -22072,7 +22156,7 @@
     <w:rPr>
       <w:rFonts w:ascii="Times New Roman" w:eastAsia="Times New Roman" w:hAnsi="Times New Roman"/>
       <w:color w:val="000000"/>
-      <w:sz w:val="24"/>
+      <w:sz w:val="26"/>
     </w:rPr>
   </w:style>
   <w:style w:styleId="FootnoteReference" w:type="character">
@@ -22081,7 +22165,7 @@
     <w:rPr>
       <w:rFonts w:ascii="Times New Roman" w:eastAsia="Times New Roman" w:hAnsi="Times New Roman"/>
       <w:color w:val="000000"/>
-      <w:sz w:val="24"/>
+      <w:sz w:val="26"/>
       <w:vertAlign w:val="superscript"/>
     </w:rPr>
   </w:style>
@@ -22091,7 +22175,7 @@
     <w:rPr>
       <w:rFonts w:ascii="Times New Roman" w:eastAsia="Times New Roman" w:hAnsi="Times New Roman"/>
       <w:color w:val="000000"/>
-      <w:sz w:val="24"/>
+      <w:sz w:val="26"/>
     </w:rPr>
   </w:style>
   <w:style w:styleId="TOCHeading" w:type="paragraph">
@@ -22102,7 +22186,7 @@
     <w:unhideWhenUsed/>
     <w:qFormat/>
     <w:pPr>
-      <w:spacing w:before="240" w:line="276" w:lineRule="auto"/>
+      <w:spacing w:before="240" w:line="360" w:lineRule="auto"/>
       <w:jc w:val="both"/>
       <w:outlineLvl w:val="9"/>
     </w:pPr>
@@ -22111,7 +22195,7 @@
       <w:b w:val="0"/>
       <w:bCs w:val="0"/>
       <w:color w:val="000000"/>
-      <w:sz w:val="24"/>
+      <w:sz w:val="26"/>
     </w:rPr>
   </w:style>
   <w:style w:type="paragraph" w:customStyle="1" w:styleId="SourceCode">

</xml_diff>